<commit_message>
updated Synopsis for monday 24/02/25
</commit_message>
<xml_diff>
--- a/Smart_Vitality_tracker_Synopsis.docx
+++ b/Smart_Vitality_tracker_Synopsis.docx
@@ -6636,9 +6636,8 @@
           <w:between w:val="nil"/>
         </w:pBdr>
         <w:tabs>
-          <w:tab w:val="left" w:pos="924"/>
-        </w:tabs>
-        <w:ind w:left="664"/>
+          <w:tab w:val="left" w:pos="0"/>
+        </w:tabs>
         <w:jc w:val="center"/>
         <w:rPr>
           <w:rFonts w:ascii="Bahnschrift SemiLight" w:eastAsia="Cambria" w:hAnsi="Bahnschrift SemiLight" w:cs="Cambria"/>
@@ -6668,7 +6667,7 @@
           <w:between w:val="nil"/>
         </w:pBdr>
         <w:tabs>
-          <w:tab w:val="left" w:pos="924"/>
+          <w:tab w:val="left" w:pos="4615"/>
         </w:tabs>
         <w:ind w:left="664"/>
         <w:rPr>
@@ -6678,6 +6677,17 @@
           <w:szCs w:val="24"/>
         </w:rPr>
       </w:pPr>
+      <w:r>
+        <w:rPr>
+          <w:rFonts w:ascii="Bahnschrift SemiLight" w:eastAsia="Cambria" w:hAnsi="Bahnschrift SemiLight" w:cs="Cambria"/>
+          <w:b/>
+          <w:sz w:val="32"/>
+          <w:szCs w:val="24"/>
+        </w:rPr>
+        <w:tab/>
+      </w:r>
+      <w:bookmarkStart w:id="0" w:name="_GoBack"/>
+      <w:bookmarkEnd w:id="0"/>
     </w:p>
     <w:p>
       <w:pPr>
@@ -6724,23 +6734,7 @@
           <w:sz w:val="28"/>
           <w:szCs w:val="28"/>
         </w:rPr>
-        <w:t xml:space="preserve">This </w:t>
-      </w:r>
-      <w:r>
-        <w:rPr>
-          <w:rFonts w:ascii="Bahnschrift SemiLight" w:eastAsia="Cambria" w:hAnsi="Bahnschrift SemiLight" w:cs="Cambria"/>
-          <w:sz w:val="28"/>
-          <w:szCs w:val="28"/>
-        </w:rPr>
-        <w:t>“Smart Vitality Tracker with AI”</w:t>
-      </w:r>
-      <w:r>
-        <w:rPr>
-          <w:rFonts w:ascii="Bahnschrift SemiLight" w:eastAsia="Cambria" w:hAnsi="Bahnschrift SemiLight" w:cs="Cambria"/>
-          <w:sz w:val="28"/>
-          <w:szCs w:val="28"/>
-        </w:rPr>
-        <w:t xml:space="preserve"> offers several key benefits:</w:t>
+        <w:t>This “Smart Vitality Tracker with AI” offers several key benefits:</w:t>
       </w:r>
     </w:p>
     <w:p>
@@ -8844,8 +8838,6 @@
           <w:lang w:val="en-IN"/>
         </w:rPr>
       </w:pPr>
-      <w:bookmarkStart w:id="0" w:name="_GoBack"/>
-      <w:bookmarkEnd w:id="0"/>
     </w:p>
     <w:sectPr>
       <w:pgSz w:w="12240" w:h="15840"/>
@@ -11399,6 +11391,7 @@
   <w:style w:type="character" w:default="1" w:styleId="DefaultParagraphFont">
     <w:name w:val="Default Paragraph Font"/>
     <w:uiPriority w:val="1"/>
+    <w:semiHidden/>
     <w:unhideWhenUsed/>
   </w:style>
   <w:style w:type="table" w:default="1" w:styleId="TableNormal">

</xml_diff>